<commit_message>
docs: cluster-aware certificate across every document
ENGINEERING_LOG section 13 records the method, the candidates compared,
the validity simulation, the corrected generator-shift experiment and the
shipped numbers. The plan README becomes the record of what was built.
README, demo guide, panel Q&A, team briefing, design rationale, project
report, function reference and the Word editions quote the new
threshold, coverage, held-out check and demo counts; test counts 435.
</commit_message>
<xml_diff>
--- a/docs/word/CodeGate_Demo_Guide.docx
+++ b/docs/word/CodeGate_Demo_Guide.docx
@@ -229,7 +229,7 @@
         <w:rPr>
           <w:rFonts w:ascii="Calibri" w:cs="Calibri" w:eastAsia="Calibri" w:hAnsi="Calibri"/>
         </w:rPr>
-        <w:t xml:space="preserve">Run this once now. It calls Groq for the 8 escalated units and caches every result by content hash — the same command during the actual demo will be instant (all cache hits, </w:t>
+        <w:t xml:space="preserve">Run this once now. It calls Groq for the 11 escalated units and caches every result by content hash — the same command during the actual demo will be instant (all cache hits, </w:t>
       </w:r>
       <w:r>
         <w:rPr>
@@ -459,7 +459,7 @@
           <w:i/>
           <w:iCs/>
         </w:rPr>
-        <w:t xml:space="preserve">"CodeGate ships with a trained model and a certificate already calibrated in the repo, so this runs with zero setup. The model was trained on about two thousand code samples written by four real LLMs, and every sample was labelled by actually running it against an attack. This table is the statistical guarantee: of the vulnerable functions it sees, at most 10% score above this threshold and get auto-approved, with 95% confidence. A stricter 5% threshold is also certified, if you want it."</w:t>
+        <w:t xml:space="preserve">"CodeGate ships with a trained model and a certificate already calibrated in the repo, so this runs with zero setup. The model was trained on about two thousand code samples written by four real LLMs, and every sample was labelled by actually running it against an attack. This table is the statistical guarantee: of the vulnerable functions it sees, at most 10% score above this threshold and get auto-approved, with 95% confidence. Each task counts once as evidence, however many models answered it, so correlated answers can't inflate the guarantee. A stricter 5% threshold is also certified, if you want it."</w:t>
       </w:r>
     </w:p>
     <w:p>
@@ -518,13 +518,13 @@
           <w:sz w:val="19"/>
           <w:szCs w:val="19"/>
         </w:rPr>
-        <w:t xml:space="preserve">Auto-approved 6 / Escalated 8 / Findings 11</w:t>
-      </w:r>
-      <w:r>
-        <w:rPr>
-          <w:rFonts w:ascii="Calibri" w:cs="Calibri" w:eastAsia="Calibri" w:hAnsi="Calibri"/>
-        </w:rPr>
-        <w:t xml:space="preserve"> (14 functions: semgrep's 3 real findings plus 8 escalated for review).</w:t>
+        <w:t xml:space="preserve">Auto-approved 3 / Escalated 11 / Findings 14</w:t>
+      </w:r>
+      <w:r>
+        <w:rPr>
+          <w:rFonts w:ascii="Calibri" w:cs="Calibri" w:eastAsia="Calibri" w:hAnsi="Calibri"/>
+        </w:rPr>
+        <w:t xml:space="preserve"> (14 functions: semgrep's 3 real findings plus 11 escalated for review). On a target this small the strict threshold escalates most functions; that costs LLM calls, never misses.</w:t>
       </w:r>
     </w:p>
     <w:p>
@@ -694,7 +694,7 @@
           <w:i/>
           <w:iCs/>
         </w:rPr>
-        <w:t xml:space="preserve">"Yes, and the shipped model is trained on it. Four local models each answered the same 510 prompts, about two thousand samples in all. Every sample was labelled by detonating it, not by pattern matching. Our first real run failed to certify anything, and that turned out to be bugs in our own labeller, not too little data. We fixed them, measured each fix against data we already had, and the next run certified. We also held out one model at a time: a certificate calibrated on three models held on the fourth, for all four. What we don't claim yet: our samples cluster by prompt, which makes the guarantee somewhat optimistic, so we ship at 10% rather than 5% until a cluster-aware certificate is done. Numbers are in </w:t>
+        <w:t xml:space="preserve">"Yes, and the shipped model is trained on it. Four local models each answered the same 510 prompts, about two thousand samples in all. Every sample was labelled by detonating it, not by pattern matching. Our first real run failed to certify anything, and that turned out to be bugs in our own labeller, not too little data. We fixed them, measured each fix against data we already had, and the next run certified. We also held out one model at a time: calibrated on three models, three of four held on the fourth, and the fourth came in at 11% against 10%, within noise. One more thing we found and fixed: four models answering the same task give correlated answers, and the standard certificate counted them as independent evidence, which made it optimistic. Ours counts each task once, and on held-out data it stays within its 10% promise. Numbers are in </w:t>
       </w:r>
       <w:r>
         <w:rPr>
@@ -711,7 +711,7 @@
           <w:i/>
           <w:iCs/>
         </w:rPr>
-        <w:t xml:space="preserve"> section 12."</w:t>
+        <w:t xml:space="preserve"> sections 12 and 13."</w:t>
       </w:r>
     </w:p>
     <w:p>
@@ -883,7 +883,7 @@
                 <w:sz w:val="19"/>
                 <w:szCs w:val="19"/>
               </w:rPr>
-              <w:t xml:space="preserve">416, all passing (CI runs on Python 3.11 and 3.13)</w:t>
+              <w:t xml:space="preserve">435, all passing (CI runs on Python 3.11 and 3.13)</w:t>
             </w:r>
           </w:p>
         </w:tc>
@@ -1013,7 +1013,7 @@
                 <w:sz w:val="19"/>
                 <w:szCs w:val="19"/>
               </w:rPr>
-              <w:t xml:space="preserve">At most 10% of vulnerable functions auto-approved, 95% confidence (α = 0.10, δ = 0.05); 5% also certified via </w:t>
+              <w:t xml:space="preserve">At most 10% of vulnerable functions auto-approved, 95% confidence (α = 0.10, δ = 0.05), counting each task once; 5% also certified via </w:t>
             </w:r>
             <w:r>
               <w:rPr>
@@ -1023,6 +1023,71 @@
                 <w:szCs w:val="17"/>
               </w:rPr>
               <w:t xml:space="preserve">--alpha 0.05</w:t>
+            </w:r>
+          </w:p>
+        </w:tc>
+      </w:tr>
+      <w:tr>
+        <w:trPr>
+          <w:tblHeader w:val="off"/>
+        </w:trPr>
+        <w:tc>
+          <w:tcPr>
+            <w:tcW w:type="dxa" w:w="2777"/>
+            <w:tcBorders>
+              <w:top w:val="single" w:color="C3CCD5" w:sz="4"/>
+              <w:left w:val="single" w:color="C3CCD5" w:sz="4"/>
+              <w:bottom w:val="single" w:color="C3CCD5" w:sz="4"/>
+              <w:right w:val="single" w:color="C3CCD5" w:sz="4"/>
+            </w:tcBorders>
+            <w:tcMar>
+              <w:top w:type="dxa" w:w="60"/>
+              <w:left w:type="dxa" w:w="100"/>
+              <w:bottom w:type="dxa" w:w="60"/>
+              <w:right w:type="dxa" w:w="100"/>
+            </w:tcMar>
+          </w:tcPr>
+          <w:p>
+            <w:pPr>
+              <w:spacing w:after="0" w:line="264"/>
+            </w:pPr>
+            <w:r>
+              <w:rPr>
+                <w:rFonts w:ascii="Calibri" w:cs="Calibri" w:eastAsia="Calibri" w:hAnsi="Calibri"/>
+                <w:sz w:val="19"/>
+                <w:szCs w:val="19"/>
+              </w:rPr>
+              <w:t xml:space="preserve">Does it hold on unseen data?</w:t>
+            </w:r>
+          </w:p>
+        </w:tc>
+        <w:tc>
+          <w:tcPr>
+            <w:tcW w:type="dxa" w:w="6249"/>
+            <w:tcBorders>
+              <w:top w:val="single" w:color="C3CCD5" w:sz="4"/>
+              <w:left w:val="single" w:color="C3CCD5" w:sz="4"/>
+              <w:bottom w:val="single" w:color="C3CCD5" w:sz="4"/>
+              <w:right w:val="single" w:color="C3CCD5" w:sz="4"/>
+            </w:tcBorders>
+            <w:tcMar>
+              <w:top w:type="dxa" w:w="60"/>
+              <w:left w:type="dxa" w:w="100"/>
+              <w:bottom w:type="dxa" w:w="60"/>
+              <w:right w:type="dxa" w:w="100"/>
+            </w:tcMar>
+          </w:tcPr>
+          <w:p>
+            <w:pPr>
+              <w:spacing w:after="0" w:line="264"/>
+            </w:pPr>
+            <w:r>
+              <w:rPr>
+                <w:rFonts w:ascii="Calibri" w:cs="Calibri" w:eastAsia="Calibri" w:hAnsi="Calibri"/>
+                <w:sz w:val="19"/>
+                <w:szCs w:val="19"/>
+              </w:rPr>
+              <w:t xml:space="preserve">Yes: 6.8% per task (8.4% per sample) of held-out vulnerable code auto-approved, against 10%</w:t>
             </w:r>
           </w:p>
         </w:tc>
@@ -1087,7 +1152,7 @@
                 <w:sz w:val="19"/>
                 <w:szCs w:val="19"/>
               </w:rPr>
-              <w:t xml:space="preserve">0.33 / 1.00 on the demo app: catches every vulnerability, over-escalates safe code</w:t>
+              <w:t xml:space="preserve">0.25 / 1.00 on the demo app: catches every vulnerability, escalates most safe code</w:t>
             </w:r>
           </w:p>
         </w:tc>
@@ -1412,7 +1477,7 @@
                 <w:sz w:val="19"/>
                 <w:szCs w:val="19"/>
               </w:rPr>
-              <w:t xml:space="preserve">Calibrated on 3 models, tested on the 4th: held for all 4</w:t>
+              <w:t xml:space="preserve">Calibrated on 3 models, tested on the 4th: 3 of 4 within 10%; codegemma 11.0% (10 of 91, not significant)</w:t>
             </w:r>
           </w:p>
         </w:tc>

</xml_diff>

<commit_message>
docs: three end-to-end reports; state the guarantee per task; record the label audit
- Three new reports (docs/reports/, Word versions in docs/word/):
  from zero, how it works, and defending it.
- The cluster-aware certificate bounds the miss rate averaged over coding
  tasks. The PDF report, README and every guide now say exactly that;
  test_report_pdf pins both wordings (cluster-aware and per-sample).
- ENGINEERING_LOG section 14: the label audit of 2026-10-05, its measured
  effect, and the corrected labels as the next planned update (branch
  wip/label-audit-2026-10-05). Certificate alternatives evaluated and
  not adopted are recorded there too.
- Regenerated the sample PDF and the Word documents.
</commit_message>
<xml_diff>
--- a/docs/word/CodeGate_Demo_Guide.docx
+++ b/docs/word/CodeGate_Demo_Guide.docx
@@ -72,7 +72,59 @@
           <w:sz w:val="20"/>
           <w:szCs w:val="20"/>
         </w:rPr>
-        <w:t xml:space="preserve">Generated 2026-10-04 from the project repository</w:t>
+        <w:t xml:space="preserve">Generated 2026-10-05 from the project repository</w:t>
+      </w:r>
+    </w:p>
+    <w:p>
+      <w:r>
+        <w:br w:type="page"/>
+      </w:r>
+    </w:p>
+    <w:p>
+      <w:pPr>
+        <w:spacing w:after="200"/>
+      </w:pPr>
+      <w:r>
+        <w:rPr>
+          <w:rFonts w:ascii="Cambria" w:cs="Cambria" w:eastAsia="Cambria" w:hAnsi="Cambria"/>
+          <w:b/>
+          <w:bCs/>
+          <w:color w:val="1F3A5F"/>
+          <w:sz w:val="34"/>
+          <w:szCs w:val="34"/>
+        </w:rPr>
+        <w:t xml:space="preserve">Contents</w:t>
+      </w:r>
+    </w:p>
+    <w:sdt>
+      <w:sdtPr>
+        <w:alias w:val="Contents"/>
+      </w:sdtPr>
+      <w:sdtContent>
+        <w:p>
+          <w:r>
+            <w:fldChar w:fldCharType="begin" w:dirty="true"/>
+            <w:instrText xml:space="preserve">TOC \h \o "1-2"</w:instrText>
+            <w:fldChar w:fldCharType="separate"/>
+          </w:r>
+        </w:p>
+        <w:p>
+          <w:r>
+            <w:fldChar w:fldCharType="end"/>
+          </w:r>
+        </w:p>
+      </w:sdtContent>
+    </w:sdt>
+    <w:p>
+      <w:r>
+        <w:rPr>
+          <w:i/>
+          <w:iCs/>
+          <w:color w:val="5B6770"/>
+          <w:sz w:val="18"/>
+          <w:szCs w:val="18"/>
+        </w:rPr>
+        <w:t xml:space="preserve">If the contents list is empty, right-click it in Word and choose Update Field.</w:t>
       </w:r>
     </w:p>
     <w:p>
@@ -229,7 +281,7 @@
         <w:rPr>
           <w:rFonts w:ascii="Calibri" w:cs="Calibri" w:eastAsia="Calibri" w:hAnsi="Calibri"/>
         </w:rPr>
-        <w:t xml:space="preserve">Run this once now. It calls Groq for the 11 escalated units and caches every result by content hash — the same command during the actual demo will be instant (all cache hits, </w:t>
+        <w:t xml:space="preserve">Run this once now. It calls Groq for the 10 escalated units and caches every result by content hash — the same command during the actual demo will be instant (all cache hits, </w:t>
       </w:r>
       <w:r>
         <w:rPr>
@@ -459,7 +511,7 @@
           <w:i/>
           <w:iCs/>
         </w:rPr>
-        <w:t xml:space="preserve">"CodeGate ships with a trained model and a certificate already calibrated in the repo, so this runs with zero setup. The model was trained on about two thousand code samples written by four real LLMs, and every sample was labelled by actually running it against an attack. This table is the statistical guarantee: of the vulnerable functions it sees, at most 10% score above this threshold and get auto-approved, with 95% confidence. Each task counts once as evidence, however many models answered it, so correlated answers can't inflate the guarantee. A stricter 5% threshold is also certified, if you want it."</w:t>
+        <w:t xml:space="preserve">"CodeGate ships with a trained model and a certificate already calibrated in the repo, so this runs with zero setup. The model was trained on about two thousand code samples written by four real LLMs, and every sample was labelled by actually running it against an attack. This table is the statistical guarantee: averaged over coding tasks, at most 10% of vulnerable functions score above this threshold and get auto-approved, with 95% confidence. Each task counts once as evidence, however many models answered it, so correlated answers can't inflate the guarantee. A stricter 5% threshold is also certified, if you want it."</w:t>
       </w:r>
     </w:p>
     <w:p>
@@ -518,13 +570,13 @@
           <w:sz w:val="19"/>
           <w:szCs w:val="19"/>
         </w:rPr>
-        <w:t xml:space="preserve">Auto-approved 3 / Escalated 11 / Findings 14</w:t>
-      </w:r>
-      <w:r>
-        <w:rPr>
-          <w:rFonts w:ascii="Calibri" w:cs="Calibri" w:eastAsia="Calibri" w:hAnsi="Calibri"/>
-        </w:rPr>
-        <w:t xml:space="preserve"> (14 functions: semgrep's 3 real findings plus 11 escalated for review). On a target this small the strict threshold escalates most functions; that costs LLM calls, never misses.</w:t>
+        <w:t xml:space="preserve">Auto-approved 4 / Escalated 10 / Findings 13</w:t>
+      </w:r>
+      <w:r>
+        <w:rPr>
+          <w:rFonts w:ascii="Calibri" w:cs="Calibri" w:eastAsia="Calibri" w:hAnsi="Calibri"/>
+        </w:rPr>
+        <w:t xml:space="preserve"> (semgrep's 3 real findings plus the 10 functions escalated for review). On a target this small the strict threshold escalates most functions; that costs LLM calls, never misses.</w:t>
       </w:r>
     </w:p>
     <w:p>
@@ -883,7 +935,7 @@
                 <w:sz w:val="19"/>
                 <w:szCs w:val="19"/>
               </w:rPr>
-              <w:t xml:space="preserve">435, all passing (CI runs on Python 3.11 and 3.13)</w:t>
+              <w:t xml:space="preserve">442, all passing (CI runs on Python 3.11 and 3.13)</w:t>
             </w:r>
           </w:p>
         </w:tc>
@@ -1013,7 +1065,7 @@
                 <w:sz w:val="19"/>
                 <w:szCs w:val="19"/>
               </w:rPr>
-              <w:t xml:space="preserve">At most 10% of vulnerable functions auto-approved, 95% confidence (α = 0.10, δ = 0.05), counting each task once; 5% also certified via </w:t>
+              <w:t xml:space="preserve">Averaged over tasks, at most 10% of vulnerable functions auto-approved, 95% confidence (α = 0.10, δ = 0.05), counting each task once; 5% also certified via </w:t>
             </w:r>
             <w:r>
               <w:rPr>
@@ -1087,7 +1139,7 @@
                 <w:sz w:val="19"/>
                 <w:szCs w:val="19"/>
               </w:rPr>
-              <w:t xml:space="preserve">Yes: 6.8% per task (8.4% per sample) of held-out vulnerable code auto-approved, against 10%</w:t>
+              <w:t xml:space="preserve">Yes: 7.6% per task (9.3% per sample) of held-out vulnerable code auto-approved, against 10%</w:t>
             </w:r>
           </w:p>
         </w:tc>
@@ -1152,7 +1204,7 @@
                 <w:sz w:val="19"/>
                 <w:szCs w:val="19"/>
               </w:rPr>
-              <w:t xml:space="preserve">0.25 / 1.00 on the demo app: catches every vulnerability, escalates most safe code</w:t>
+              <w:t xml:space="preserve">0.27 / 1.00 on the demo app: catches every vulnerability, escalates most safe code</w:t>
             </w:r>
           </w:p>
         </w:tc>
@@ -1282,7 +1334,7 @@
                 <w:sz w:val="19"/>
                 <w:szCs w:val="19"/>
               </w:rPr>
-              <w:t xml:space="preserve">ROC-AUC 0.891 on held-out data it never trained on</w:t>
+              <w:t xml:space="preserve">ROC-AUC 0.889 on held-out data it never trained on</w:t>
             </w:r>
           </w:p>
         </w:tc>
@@ -1412,7 +1464,7 @@
                 <w:sz w:val="19"/>
                 <w:szCs w:val="19"/>
               </w:rPr>
-              <w:t xml:space="preserve">6.7% (was 28.3% before the labeller fixes, see section 12)</w:t>
+              <w:t xml:space="preserve">6.6% (was 28.3% before the labeller fixes, see section 12)</w:t>
             </w:r>
           </w:p>
         </w:tc>

</xml_diff>

<commit_message>
docs(word): sync the six Word documents with the updated Markdown
Block-level sync from each Markdown file's change since main, applied in
place so the cover page, contents, headers and styling are kept; every
current Markdown block verified present and no removed block left.
</commit_message>
<xml_diff>
--- a/docs/word/CodeGate_Demo_Guide.docx
+++ b/docs/word/CodeGate_Demo_Guide.docx
@@ -935,7 +935,7 @@
                 <w:sz w:val="19"/>
                 <w:szCs w:val="19"/>
               </w:rPr>
-              <w:t xml:space="preserve">442, all passing (CI runs on Python 3.11 and 3.13)</w:t>
+              <w:t xml:space="preserve">515, all passing (CI runs on Python 3.11 and 3.13)</w:t>
             </w:r>
           </w:p>
         </w:tc>
@@ -1139,7 +1139,7 @@
                 <w:sz w:val="19"/>
                 <w:szCs w:val="19"/>
               </w:rPr>
-              <w:t xml:space="preserve">Yes: 7.6% per task (9.3% per sample) of held-out vulnerable code auto-approved, against 10%</w:t>
+              <w:t xml:space="preserve">Yes: 9.3% per task of held-out vulnerable code auto-approved, against the 10% bound (10.7% pooled per sample, which is not the certified quantity)</w:t>
             </w:r>
           </w:p>
         </w:tc>
@@ -1334,7 +1334,7 @@
                 <w:sz w:val="19"/>
                 <w:szCs w:val="19"/>
               </w:rPr>
-              <w:t xml:space="preserve">ROC-AUC 0.889 on held-out data it never trained on</w:t>
+              <w:t xml:space="preserve">ROC-AUC 0.903 on held-out data it never trained on</w:t>
             </w:r>
           </w:p>
         </w:tc>
@@ -1464,7 +1464,7 @@
                 <w:sz w:val="19"/>
                 <w:szCs w:val="19"/>
               </w:rPr>
-              <w:t xml:space="preserve">6.6% (was 28.3% before the labeller fixes, see section 12)</w:t>
+              <w:t xml:space="preserve">5.6% (was 28.3% before the labeller fixes of section 12, 6.6% before the label audit of sections 14–15)</w:t>
             </w:r>
           </w:p>
         </w:tc>
@@ -1529,7 +1529,7 @@
                 <w:sz w:val="19"/>
                 <w:szCs w:val="19"/>
               </w:rPr>
-              <w:t xml:space="preserve">Calibrated on 3 models, tested on the 4th: 3 of 4 within 10%; codegemma 11.0% (10 of 91, not significant)</w:t>
+              <w:t xml:space="preserve">Calibrated on 3 models, tested on the 4th: 3 of 4 within 10%; codegemma 10.5% (10 of 95, not significant)</w:t>
             </w:r>
           </w:p>
         </w:tc>

</xml_diff>